<commit_message>
Fix engine-internal function-name leak in Kayma Liburd's milestones text
milestones4wk/milestones8wk referenced proteinTargets()/epley1RM()/
workingLoad() by name in prose meant for both the trainer and client
view — summary text has no audience-filtering mechanism (same class of
gap batch D found in baselines[] cells and block intro text), so the
fix is rewording rather than hiding: describes what happens in plain
language instead of naming the internal functions that make it happen.
</commit_message>
<xml_diff>
--- a/clients/kayma_liburd/Kayma_Liburd_2Day_Training_Plan.docx
+++ b/clients/kayma_liburd/Kayma_Liburd_2Day_Training_Plan.docx
@@ -10441,7 +10441,7 @@
           <w:sz w:val="17"/>
           <w:szCs w:val="17"/>
         </w:rPr>
-        <w:t xml:space="preserve">Complete the Styku scan and full 11-exercise ICONS Baseline Testing Protocol within the first 2-4 weeks, under continued physician/cardiologist coordination given the cardiac flag — this converts every descriptive load band above into a numeric working weight and unlocks proteinTargets()/full clinical interpretation (ALST, VFA, BMI). Until then, track RIR and load progression qualitatively — add weight only when the prescribed reps land at 1-2 RIR with clean form. Confirm the HR monitor has not read above 160 bpm in any session; if it has, flag for a programming review before continuing.</w:t>
+        <w:t xml:space="preserve">Complete the Styku scan and full 11-exercise ICONS Baseline Testing Protocol within the first 2-4 weeks, under continued physician/cardiologist coordination given the cardiac flag — this converts every descriptive load band above into a numeric working weight and unlocks full clinical interpretation (ALST, VFA, BMI) plus your personalized protein/creatine targets. Until then, track RIR and load progression qualitatively — add weight only when the prescribed reps land at 1-2 RIR with clean form. Confirm the HR monitor has not read above 160 bpm in any session; if it has, flag for a programming review before continuing.</w:t>
       </w:r>
     </w:p>
     <w:p>
@@ -10466,7 +10466,7 @@
           <w:sz w:val="17"/>
           <w:szCs w:val="17"/>
         </w:rPr>
-        <w:t xml:space="preserve">With scan and battery data on file, rebuild this plan's LOAD column using epley1RM()/workingLoad() off real 1RM numbers, and add the evidence-based nutrition block (protein/creatine targets) once weight is known. Reassess whether 44 remains an accurate placeholder age or should be corrected against her actual age. Re-confirm cardiac clearance/coordination status before increasing conditioning-block duration or intensity beyond what is prescribed here.</w:t>
+        <w:t xml:space="preserve">With scan and battery data on file, this plan's load prescriptions get rebuilt off your real tested numbers, and the evidence-based nutrition block (protein/creatine targets) gets added once weight is known. Reassess whether 44 remains an accurate placeholder age or should be corrected against her actual age. Re-confirm cardiac clearance/coordination status before increasing conditioning-block duration or intensity beyond what is prescribed here.</w:t>
       </w:r>
     </w:p>
     <w:p>

</xml_diff>